<commit_message>
Added Readme.md New Version
</commit_message>
<xml_diff>
--- a/Pulse Documentation version 1.docx
+++ b/Pulse Documentation version 1.docx
@@ -259,7 +259,7 @@
                                     <w:sz w:val="28"/>
                                     <w:szCs w:val="28"/>
                                   </w:rPr>
-                                  <w:t>Mujeeb Arshad</w:t>
+                                  <w:t>Huzaifa Aousaf</w:t>
                                 </w:r>
                                 <w:r>
                                   <w:rPr>
@@ -314,25 +314,7 @@
                                     <w:sz w:val="28"/>
                                     <w:szCs w:val="28"/>
                                   </w:rPr>
-                                  <w:t>Huzaifa</w:t>
-                                </w:r>
-                                <w:r>
-                                  <w:rPr>
-                                    <w:rFonts w:cs="Times New Roman" w:ascii="Arial Nova" w:hAnsi="Arial Nova"/>
-                                    <w:color w:val="000000"/>
-                                    <w:sz w:val="28"/>
-                                    <w:szCs w:val="28"/>
-                                  </w:rPr>
-                                  <w:t xml:space="preserve"> </w:t>
-                                </w:r>
-                                <w:r>
-                                  <w:rPr>
-                                    <w:rFonts w:cs="Times New Roman" w:ascii="Arial Nova" w:hAnsi="Arial Nova"/>
-                                    <w:color w:val="000000"/>
-                                    <w:sz w:val="28"/>
-                                    <w:szCs w:val="28"/>
-                                  </w:rPr>
-                                  <w:t>Aousaf</w:t>
+                                  <w:t>Mujeeb Arshad</w:t>
                                 </w:r>
                                 <w:r>
                                   <w:rPr>
@@ -908,7 +890,7 @@
                               <w:sz w:val="28"/>
                               <w:szCs w:val="28"/>
                             </w:rPr>
-                            <w:t>Mujeeb Arshad</w:t>
+                            <w:t>Huzaifa Aousaf</w:t>
                           </w:r>
                           <w:r>
                             <w:rPr>
@@ -963,25 +945,7 @@
                               <w:sz w:val="28"/>
                               <w:szCs w:val="28"/>
                             </w:rPr>
-                            <w:t>Huzaifa</w:t>
-                          </w:r>
-                          <w:r>
-                            <w:rPr>
-                              <w:rFonts w:cs="Times New Roman" w:ascii="Arial Nova" w:hAnsi="Arial Nova"/>
-                              <w:color w:val="000000"/>
-                              <w:sz w:val="28"/>
-                              <w:szCs w:val="28"/>
-                            </w:rPr>
-                            <w:t xml:space="preserve"> </w:t>
-                          </w:r>
-                          <w:r>
-                            <w:rPr>
-                              <w:rFonts w:cs="Times New Roman" w:ascii="Arial Nova" w:hAnsi="Arial Nova"/>
-                              <w:color w:val="000000"/>
-                              <w:sz w:val="28"/>
-                              <w:szCs w:val="28"/>
-                            </w:rPr>
-                            <w:t>Aousaf</w:t>
+                            <w:t>Mujeeb Arshad</w:t>
                           </w:r>
                           <w:r>
                             <w:rPr>
@@ -12636,96 +12600,16 @@
         <w:pStyle w:val="ListParagraph"/>
         <w:ind w:hanging="0" w:start="0"/>
         <w:rPr>
-          <w:rFonts w:ascii="Liberation Serif" w:hAnsi="Liberation Serif" w:cs="Times New Roman"/>
           <w:b/>
           <w:bCs/>
-          <w:sz w:val="24"/>
-          <w:szCs w:val="24"/>
         </w:rPr>
       </w:pPr>
       <w:r>
         <w:rPr>
           <w:rFonts w:cs="Times New Roman" w:ascii="Liberation Serif" w:hAnsi="Liberation Serif"/>
-          <w:b/>
-          <w:bCs/>
-          <w:sz w:val="24"/>
-          <w:szCs w:val="24"/>
-        </w:rPr>
-        <w:t>Change in Team Lead:</w:t>
-      </w:r>
-    </w:p>
-    <w:p>
-      <w:pPr>
-        <w:pStyle w:val="ListParagraph"/>
-        <w:ind w:hanging="0" w:start="0"/>
-        <w:rPr>
-          <w:rFonts w:ascii="Liberation Serif" w:hAnsi="Liberation Serif" w:cs="Times New Roman"/>
-          <w:sz w:val="24"/>
-          <w:szCs w:val="24"/>
-        </w:rPr>
-      </w:pPr>
-      <w:r>
-        <w:rPr>
-          <w:rFonts w:cs="Times New Roman" w:ascii="Liberation Serif" w:hAnsi="Liberation Serif"/>
-          <w:sz w:val="24"/>
-          <w:szCs w:val="24"/>
-        </w:rPr>
-        <w:t xml:space="preserve">                                     </w:t>
-      </w:r>
-      <w:r>
-        <w:rPr>
-          <w:rFonts w:cs="Times New Roman" w:ascii="Liberation Serif" w:hAnsi="Liberation Serif"/>
-          <w:sz w:val="24"/>
-          <w:szCs w:val="24"/>
-        </w:rPr>
-        <w:t xml:space="preserve">Previous Team Lead: </w:t>
-      </w:r>
-      <w:r>
-        <w:rPr>
-          <w:rFonts w:cs="Times New Roman" w:ascii="Liberation Serif" w:hAnsi="Liberation Serif"/>
-          <w:b/>
-          <w:bCs/>
-          <w:sz w:val="24"/>
-          <w:szCs w:val="24"/>
-        </w:rPr>
-        <w:t>Huzaifa Aousaf</w:t>
-      </w:r>
-    </w:p>
-    <w:p>
-      <w:pPr>
-        <w:pStyle w:val="ListParagraph"/>
-        <w:ind w:hanging="0" w:start="0"/>
-        <w:rPr>
-          <w:rFonts w:ascii="Liberation Serif" w:hAnsi="Liberation Serif" w:cs="Times New Roman"/>
-          <w:sz w:val="24"/>
-          <w:szCs w:val="24"/>
-        </w:rPr>
-      </w:pPr>
-      <w:r>
-        <w:rPr>
-          <w:rFonts w:cs="Times New Roman" w:ascii="Liberation Serif" w:hAnsi="Liberation Serif"/>
-          <w:sz w:val="24"/>
-          <w:szCs w:val="24"/>
-        </w:rPr>
-        <w:t xml:space="preserve">                                     </w:t>
-      </w:r>
-      <w:r>
-        <w:rPr>
-          <w:rFonts w:cs="Times New Roman" w:ascii="Liberation Serif" w:hAnsi="Liberation Serif"/>
-          <w:sz w:val="24"/>
-          <w:szCs w:val="24"/>
-        </w:rPr>
-        <w:t xml:space="preserve">New Team Lead : </w:t>
-      </w:r>
-      <w:r>
-        <w:rPr>
-          <w:rFonts w:cs="Times New Roman" w:ascii="Liberation Serif" w:hAnsi="Liberation Serif"/>
-          <w:b/>
-          <w:bCs/>
-          <w:sz w:val="24"/>
-          <w:szCs w:val="24"/>
-        </w:rPr>
-        <w:t>Mujeeb Arshad</w:t>
+          <w:sz w:val="24"/>
+          <w:szCs w:val="24"/>
+        </w:rPr>
       </w:r>
     </w:p>
     <w:p>
@@ -12824,7 +12708,7 @@
         </w:r>
         <w:r>
           <w:rPr/>
-          <w:t>22</w:t>
+          <w:t>23</w:t>
         </w:r>
         <w:r>
           <w:rPr/>
@@ -12923,7 +12807,7 @@
               <wp:positionV relativeFrom="page">
                 <wp:align>center</wp:align>
               </wp:positionV>
-              <wp:extent cx="7476490" cy="9642475"/>
+              <wp:extent cx="7526655" cy="9697720"/>
               <wp:effectExtent l="8255" t="8255" r="8255" b="8255"/>
               <wp:wrapNone/>
               <wp:docPr id="19" name="Rectangle 233"/>
@@ -12934,7 +12818,7 @@
                     <wps:spPr>
                       <a:xfrm>
                         <a:off x="0" y="0"/>
-                        <a:ext cx="7476480" cy="9642600"/>
+                        <a:ext cx="7526520" cy="9697680"/>
                       </a:xfrm>
                       <a:prstGeom prst="rect">
                         <a:avLst/>
@@ -12975,7 +12859,7 @@
         </mc:Choice>
         <mc:Fallback>
           <w:pict>
-            <v:rect id="shape_0" stroked="t" o:allowincell="f" style="position:absolute;margin-left:-6pt;margin-top:16.35pt;width:588.65pt;height:759.2pt;mso-wrap-style:none;v-text-anchor:middle;mso-position-horizontal-relative:page;mso-position-vertical:center;mso-position-vertical-relative:page" wp14:anchorId="04958152">
+            <v:rect id="shape_0" stroked="t" o:allowincell="f" style="position:absolute;margin-left:-6pt;margin-top:14.2pt;width:592.6pt;height:763.55pt;mso-wrap-style:none;v-text-anchor:middle;mso-position-horizontal-relative:page;mso-position-vertical:center;mso-position-vertical-relative:page" wp14:anchorId="04958152">
               <v:fill o:detectmouseclick="t" on="false"/>
               <v:stroke color="#747474" weight="15840" joinstyle="miter" endcap="flat"/>
               <w10:wrap type="none"/>

</xml_diff>